<commit_message>
Cohorte octubre 2026: inicio semana del 12, cierre domingo 11, Ninos desde el 19; profesora Kiran; Dubu en menu, footer y con navegacion propia
- lib/nivel1.ts + paginas + diccionarios EN/KO: fechas 12 oct / 11 oct / 30 nov, Guiran -> Kiran (id interno se mantiene)
- Documentos regenerados (6 PDFs por curso + Programa Completo ES/EN DOCX y PDF) con calendario nuevo y Kiran
- Emails Brevo, plan de choque (ahora 20 sep -> 13 oct), campana, boletin de Instagram (7 PNG) y captions actualizados
- Dubu: enlace en Recursos del menu, columna "Gratis" del footer, home y /recursos; barra de sitio y pie dentro del juego; /dubu en el sitemap
- CLAUDE.md al dia (cohorte, Kiran, Dubu, plan vigente)

Co-Authored-By: Claude Opus 5 <noreply@anthropic.com>
</commit_message>
<xml_diff>
--- a/Programa_Completo_Octubre_2026/Programa_Completo_Octubre_2026_EN.docx
+++ b/Programa_Completo_Octubre_2026/Programa_Completo_Octubre_2026_EN.docx
@@ -126,7 +126,7 @@
           <w:sz w:val="23"/>
           <w:szCs w:val="23"/>
         </w:rPr>
-        <w:t xml:space="preserve">Week of October 5 → week of November 23, 2026</w:t>
+        <w:t xml:space="preserve">Week of October 12 → week of November 30, 2026</w:t>
       </w:r>
     </w:p>
     <w:p>
@@ -942,7 +942,7 @@
                 <w:sz w:val="20"/>
                 <w:szCs w:val="20"/>
               </w:rPr>
-              <w:t xml:space="preserve">Guiran · 기란</w:t>
+              <w:t xml:space="preserve">Kiran · 기란</w:t>
             </w:r>
           </w:p>
         </w:tc>
@@ -1772,7 +1772,7 @@
                 <w:sz w:val="18"/>
                 <w:szCs w:val="18"/>
               </w:rPr>
-              <w:t xml:space="preserve">Guiran</w:t>
+              <w:t xml:space="preserve">Kiran</w:t>
             </w:r>
           </w:p>
         </w:tc>
@@ -2953,7 +2953,7 @@
                 <w:sz w:val="18"/>
                 <w:szCs w:val="18"/>
               </w:rPr>
-              <w:t xml:space="preserve">Oct 5 – Oct 9</w:t>
+              <w:t xml:space="preserve">Oct 12 – Oct 16</w:t>
             </w:r>
           </w:p>
         </w:tc>
@@ -2979,7 +2979,7 @@
                 <w:sz w:val="18"/>
                 <w:szCs w:val="18"/>
               </w:rPr>
-              <w:t xml:space="preserve">Mon Oct 5</w:t>
+              <w:t xml:space="preserve">Mon Oct 19 *</w:t>
             </w:r>
           </w:p>
         </w:tc>
@@ -3005,7 +3005,7 @@
                 <w:sz w:val="18"/>
                 <w:szCs w:val="18"/>
               </w:rPr>
-              <w:t xml:space="preserve">Tue Oct 6</w:t>
+              <w:t xml:space="preserve">Tue Oct 13</w:t>
             </w:r>
           </w:p>
         </w:tc>
@@ -3031,7 +3031,7 @@
                 <w:sz w:val="18"/>
                 <w:szCs w:val="18"/>
               </w:rPr>
-              <w:t xml:space="preserve">Tue Oct 6</w:t>
+              <w:t xml:space="preserve">Tue Oct 13</w:t>
             </w:r>
           </w:p>
         </w:tc>
@@ -3057,7 +3057,7 @@
                 <w:sz w:val="18"/>
                 <w:szCs w:val="18"/>
               </w:rPr>
-              <w:t xml:space="preserve">Wed Oct 7</w:t>
+              <w:t xml:space="preserve">Wed Oct 14</w:t>
             </w:r>
           </w:p>
         </w:tc>
@@ -3083,7 +3083,7 @@
                 <w:sz w:val="18"/>
                 <w:szCs w:val="18"/>
               </w:rPr>
-              <w:t xml:space="preserve">Thu Oct 8</w:t>
+              <w:t xml:space="preserve">Thu Oct 15</w:t>
             </w:r>
           </w:p>
         </w:tc>
@@ -3109,7 +3109,7 @@
                 <w:sz w:val="18"/>
                 <w:szCs w:val="18"/>
               </w:rPr>
-              <w:t xml:space="preserve">Thu Oct 8</w:t>
+              <w:t xml:space="preserve">Thu Oct 15</w:t>
             </w:r>
           </w:p>
         </w:tc>
@@ -3168,7 +3168,7 @@
                 <w:sz w:val="18"/>
                 <w:szCs w:val="18"/>
               </w:rPr>
-              <w:t xml:space="preserve">Oct 12 – Oct 16</w:t>
+              <w:t xml:space="preserve">Oct 19 – Oct 23</w:t>
             </w:r>
           </w:p>
         </w:tc>
@@ -3195,7 +3195,7 @@
                 <w:sz w:val="18"/>
                 <w:szCs w:val="18"/>
               </w:rPr>
-              <w:t xml:space="preserve">Mon Oct 12 *</w:t>
+              <w:t xml:space="preserve">Mon Oct 26</w:t>
             </w:r>
           </w:p>
         </w:tc>
@@ -3222,7 +3222,7 @@
                 <w:sz w:val="18"/>
                 <w:szCs w:val="18"/>
               </w:rPr>
-              <w:t xml:space="preserve">Tue Oct 13</w:t>
+              <w:t xml:space="preserve">Tue Oct 20</w:t>
             </w:r>
           </w:p>
         </w:tc>
@@ -3249,7 +3249,7 @@
                 <w:sz w:val="18"/>
                 <w:szCs w:val="18"/>
               </w:rPr>
-              <w:t xml:space="preserve">Tue Oct 13</w:t>
+              <w:t xml:space="preserve">Tue Oct 20</w:t>
             </w:r>
           </w:p>
         </w:tc>
@@ -3276,7 +3276,7 @@
                 <w:sz w:val="18"/>
                 <w:szCs w:val="18"/>
               </w:rPr>
-              <w:t xml:space="preserve">Wed Oct 14</w:t>
+              <w:t xml:space="preserve">Wed Oct 21</w:t>
             </w:r>
           </w:p>
         </w:tc>
@@ -3303,7 +3303,7 @@
                 <w:sz w:val="18"/>
                 <w:szCs w:val="18"/>
               </w:rPr>
-              <w:t xml:space="preserve">Thu Oct 15</w:t>
+              <w:t xml:space="preserve">Thu Oct 22</w:t>
             </w:r>
           </w:p>
         </w:tc>
@@ -3330,7 +3330,7 @@
                 <w:sz w:val="18"/>
                 <w:szCs w:val="18"/>
               </w:rPr>
-              <w:t xml:space="preserve">Thu Oct 15</w:t>
+              <w:t xml:space="preserve">Thu Oct 22</w:t>
             </w:r>
           </w:p>
         </w:tc>
@@ -3387,7 +3387,7 @@
                 <w:sz w:val="18"/>
                 <w:szCs w:val="18"/>
               </w:rPr>
-              <w:t xml:space="preserve">Oct 19 – Oct 23</w:t>
+              <w:t xml:space="preserve">Oct 26 – Oct 30</w:t>
             </w:r>
           </w:p>
         </w:tc>
@@ -3413,7 +3413,7 @@
                 <w:sz w:val="18"/>
                 <w:szCs w:val="18"/>
               </w:rPr>
-              <w:t xml:space="preserve">Mon Oct 19</w:t>
+              <w:t xml:space="preserve">Mon Nov 2</w:t>
             </w:r>
           </w:p>
         </w:tc>
@@ -3439,7 +3439,7 @@
                 <w:sz w:val="18"/>
                 <w:szCs w:val="18"/>
               </w:rPr>
-              <w:t xml:space="preserve">Tue Oct 20</w:t>
+              <w:t xml:space="preserve">Tue Oct 27</w:t>
             </w:r>
           </w:p>
         </w:tc>
@@ -3465,7 +3465,7 @@
                 <w:sz w:val="18"/>
                 <w:szCs w:val="18"/>
               </w:rPr>
-              <w:t xml:space="preserve">Tue Oct 20</w:t>
+              <w:t xml:space="preserve">Tue Oct 27</w:t>
             </w:r>
           </w:p>
         </w:tc>
@@ -3491,7 +3491,7 @@
                 <w:sz w:val="18"/>
                 <w:szCs w:val="18"/>
               </w:rPr>
-              <w:t xml:space="preserve">Wed Oct 21</w:t>
+              <w:t xml:space="preserve">Wed Oct 28</w:t>
             </w:r>
           </w:p>
         </w:tc>
@@ -3517,7 +3517,7 @@
                 <w:sz w:val="18"/>
                 <w:szCs w:val="18"/>
               </w:rPr>
-              <w:t xml:space="preserve">Thu Oct 22</w:t>
+              <w:t xml:space="preserve">Thu Oct 29</w:t>
             </w:r>
           </w:p>
         </w:tc>
@@ -3543,7 +3543,7 @@
                 <w:sz w:val="18"/>
                 <w:szCs w:val="18"/>
               </w:rPr>
-              <w:t xml:space="preserve">Thu Oct 22</w:t>
+              <w:t xml:space="preserve">Thu Oct 29</w:t>
             </w:r>
           </w:p>
         </w:tc>
@@ -3602,7 +3602,7 @@
                 <w:sz w:val="18"/>
                 <w:szCs w:val="18"/>
               </w:rPr>
-              <w:t xml:space="preserve">Oct 26 – Oct 30</w:t>
+              <w:t xml:space="preserve">Nov 2 – Nov 6</w:t>
             </w:r>
           </w:p>
         </w:tc>
@@ -3629,7 +3629,7 @@
                 <w:sz w:val="18"/>
                 <w:szCs w:val="18"/>
               </w:rPr>
-              <w:t xml:space="preserve">Mon Oct 26</w:t>
+              <w:t xml:space="preserve">Mon Nov 9</w:t>
             </w:r>
           </w:p>
         </w:tc>
@@ -3656,7 +3656,7 @@
                 <w:sz w:val="18"/>
                 <w:szCs w:val="18"/>
               </w:rPr>
-              <w:t xml:space="preserve">Tue Oct 27</w:t>
+              <w:t xml:space="preserve">Tue Nov 3</w:t>
             </w:r>
           </w:p>
         </w:tc>
@@ -3683,7 +3683,7 @@
                 <w:sz w:val="18"/>
                 <w:szCs w:val="18"/>
               </w:rPr>
-              <w:t xml:space="preserve">Tue Oct 27</w:t>
+              <w:t xml:space="preserve">Tue Nov 3</w:t>
             </w:r>
           </w:p>
         </w:tc>
@@ -3710,7 +3710,7 @@
                 <w:sz w:val="18"/>
                 <w:szCs w:val="18"/>
               </w:rPr>
-              <w:t xml:space="preserve">Wed Oct 28</w:t>
+              <w:t xml:space="preserve">Wed Nov 4</w:t>
             </w:r>
           </w:p>
         </w:tc>
@@ -3737,7 +3737,7 @@
                 <w:sz w:val="18"/>
                 <w:szCs w:val="18"/>
               </w:rPr>
-              <w:t xml:space="preserve">Thu Oct 29</w:t>
+              <w:t xml:space="preserve">Thu Nov 5</w:t>
             </w:r>
           </w:p>
         </w:tc>
@@ -3764,7 +3764,7 @@
                 <w:sz w:val="18"/>
                 <w:szCs w:val="18"/>
               </w:rPr>
-              <w:t xml:space="preserve">Thu Oct 29</w:t>
+              <w:t xml:space="preserve">Thu Nov 5</w:t>
             </w:r>
           </w:p>
         </w:tc>
@@ -3821,7 +3821,7 @@
                 <w:sz w:val="18"/>
                 <w:szCs w:val="18"/>
               </w:rPr>
-              <w:t xml:space="preserve">Nov 2 – Nov 6</w:t>
+              <w:t xml:space="preserve">Nov 9 – Nov 13</w:t>
             </w:r>
           </w:p>
         </w:tc>
@@ -3847,7 +3847,7 @@
                 <w:sz w:val="18"/>
                 <w:szCs w:val="18"/>
               </w:rPr>
-              <w:t xml:space="preserve">Mon Nov 2</w:t>
+              <w:t xml:space="preserve">Mon Nov 16</w:t>
             </w:r>
           </w:p>
         </w:tc>
@@ -3873,7 +3873,7 @@
                 <w:sz w:val="18"/>
                 <w:szCs w:val="18"/>
               </w:rPr>
-              <w:t xml:space="preserve">Tue Nov 3</w:t>
+              <w:t xml:space="preserve">Tue Nov 10</w:t>
             </w:r>
           </w:p>
         </w:tc>
@@ -3899,7 +3899,7 @@
                 <w:sz w:val="18"/>
                 <w:szCs w:val="18"/>
               </w:rPr>
-              <w:t xml:space="preserve">Tue Nov 3</w:t>
+              <w:t xml:space="preserve">Tue Nov 10</w:t>
             </w:r>
           </w:p>
         </w:tc>
@@ -3925,7 +3925,7 @@
                 <w:sz w:val="18"/>
                 <w:szCs w:val="18"/>
               </w:rPr>
-              <w:t xml:space="preserve">Wed Nov 4</w:t>
+              <w:t xml:space="preserve">Wed Nov 11</w:t>
             </w:r>
           </w:p>
         </w:tc>
@@ -3951,7 +3951,7 @@
                 <w:sz w:val="18"/>
                 <w:szCs w:val="18"/>
               </w:rPr>
-              <w:t xml:space="preserve">Thu Nov 5</w:t>
+              <w:t xml:space="preserve">Thu Nov 12</w:t>
             </w:r>
           </w:p>
         </w:tc>
@@ -3977,7 +3977,7 @@
                 <w:sz w:val="18"/>
                 <w:szCs w:val="18"/>
               </w:rPr>
-              <w:t xml:space="preserve">Thu Nov 5</w:t>
+              <w:t xml:space="preserve">Thu Nov 12</w:t>
             </w:r>
           </w:p>
         </w:tc>
@@ -4036,7 +4036,7 @@
                 <w:sz w:val="18"/>
                 <w:szCs w:val="18"/>
               </w:rPr>
-              <w:t xml:space="preserve">Nov 9 – Nov 13</w:t>
+              <w:t xml:space="preserve">Nov 16 – Nov 20</w:t>
             </w:r>
           </w:p>
         </w:tc>
@@ -4063,7 +4063,7 @@
                 <w:sz w:val="18"/>
                 <w:szCs w:val="18"/>
               </w:rPr>
-              <w:t xml:space="preserve">Mon Nov 9</w:t>
+              <w:t xml:space="preserve">Mon Nov 23</w:t>
             </w:r>
           </w:p>
         </w:tc>
@@ -4090,7 +4090,7 @@
                 <w:sz w:val="18"/>
                 <w:szCs w:val="18"/>
               </w:rPr>
-              <w:t xml:space="preserve">Tue Nov 10</w:t>
+              <w:t xml:space="preserve">Tue Nov 17</w:t>
             </w:r>
           </w:p>
         </w:tc>
@@ -4117,7 +4117,7 @@
                 <w:sz w:val="18"/>
                 <w:szCs w:val="18"/>
               </w:rPr>
-              <w:t xml:space="preserve">Tue Nov 10</w:t>
+              <w:t xml:space="preserve">Tue Nov 17</w:t>
             </w:r>
           </w:p>
         </w:tc>
@@ -4144,7 +4144,7 @@
                 <w:sz w:val="18"/>
                 <w:szCs w:val="18"/>
               </w:rPr>
-              <w:t xml:space="preserve">Wed Nov 11</w:t>
+              <w:t xml:space="preserve">Wed Nov 18</w:t>
             </w:r>
           </w:p>
         </w:tc>
@@ -4171,7 +4171,7 @@
                 <w:sz w:val="18"/>
                 <w:szCs w:val="18"/>
               </w:rPr>
-              <w:t xml:space="preserve">Thu Nov 12</w:t>
+              <w:t xml:space="preserve">Thu Nov 19</w:t>
             </w:r>
           </w:p>
         </w:tc>
@@ -4198,7 +4198,7 @@
                 <w:sz w:val="18"/>
                 <w:szCs w:val="18"/>
               </w:rPr>
-              <w:t xml:space="preserve">Thu Nov 12</w:t>
+              <w:t xml:space="preserve">Thu Nov 19</w:t>
             </w:r>
           </w:p>
         </w:tc>
@@ -4255,7 +4255,7 @@
                 <w:sz w:val="18"/>
                 <w:szCs w:val="18"/>
               </w:rPr>
-              <w:t xml:space="preserve">Nov 16 – Nov 20</w:t>
+              <w:t xml:space="preserve">Nov 23 – Nov 27</w:t>
             </w:r>
           </w:p>
         </w:tc>
@@ -4281,7 +4281,7 @@
                 <w:sz w:val="18"/>
                 <w:szCs w:val="18"/>
               </w:rPr>
-              <w:t xml:space="preserve">Mon Nov 16</w:t>
+              <w:t xml:space="preserve">Mon Nov 30</w:t>
             </w:r>
           </w:p>
         </w:tc>
@@ -4307,7 +4307,7 @@
                 <w:sz w:val="18"/>
                 <w:szCs w:val="18"/>
               </w:rPr>
-              <w:t xml:space="preserve">Tue Nov 17</w:t>
+              <w:t xml:space="preserve">Tue Nov 24</w:t>
             </w:r>
           </w:p>
         </w:tc>
@@ -4333,7 +4333,7 @@
                 <w:sz w:val="18"/>
                 <w:szCs w:val="18"/>
               </w:rPr>
-              <w:t xml:space="preserve">Tue Nov 17</w:t>
+              <w:t xml:space="preserve">Tue Nov 24</w:t>
             </w:r>
           </w:p>
         </w:tc>
@@ -4359,7 +4359,7 @@
                 <w:sz w:val="18"/>
                 <w:szCs w:val="18"/>
               </w:rPr>
-              <w:t xml:space="preserve">Wed Nov 18</w:t>
+              <w:t xml:space="preserve">Wed Nov 25</w:t>
             </w:r>
           </w:p>
         </w:tc>
@@ -4385,7 +4385,7 @@
                 <w:sz w:val="18"/>
                 <w:szCs w:val="18"/>
               </w:rPr>
-              <w:t xml:space="preserve">Thu Nov 19</w:t>
+              <w:t xml:space="preserve">Thu Nov 26</w:t>
             </w:r>
           </w:p>
         </w:tc>
@@ -4411,7 +4411,7 @@
                 <w:sz w:val="18"/>
                 <w:szCs w:val="18"/>
               </w:rPr>
-              <w:t xml:space="preserve">Thu Nov 19</w:t>
+              <w:t xml:space="preserve">Thu Nov 26</w:t>
             </w:r>
           </w:p>
         </w:tc>
@@ -4470,7 +4470,7 @@
                 <w:sz w:val="18"/>
                 <w:szCs w:val="18"/>
               </w:rPr>
-              <w:t xml:space="preserve">Nov 23 – Nov 27</w:t>
+              <w:t xml:space="preserve">Nov 30 – Dec 4</w:t>
             </w:r>
           </w:p>
         </w:tc>
@@ -4497,7 +4497,7 @@
                 <w:sz w:val="18"/>
                 <w:szCs w:val="18"/>
               </w:rPr>
-              <w:t xml:space="preserve">Mon Nov 23</w:t>
+              <w:t xml:space="preserve">Mon Dec 7</w:t>
             </w:r>
           </w:p>
         </w:tc>
@@ -4524,7 +4524,7 @@
                 <w:sz w:val="18"/>
                 <w:szCs w:val="18"/>
               </w:rPr>
-              <w:t xml:space="preserve">Tue Nov 24</w:t>
+              <w:t xml:space="preserve">Tue Dec 1</w:t>
             </w:r>
           </w:p>
         </w:tc>
@@ -4551,7 +4551,7 @@
                 <w:sz w:val="18"/>
                 <w:szCs w:val="18"/>
               </w:rPr>
-              <w:t xml:space="preserve">Tue Nov 24</w:t>
+              <w:t xml:space="preserve">Tue Dec 1</w:t>
             </w:r>
           </w:p>
         </w:tc>
@@ -4578,7 +4578,7 @@
                 <w:sz w:val="18"/>
                 <w:szCs w:val="18"/>
               </w:rPr>
-              <w:t xml:space="preserve">Wed Nov 25</w:t>
+              <w:t xml:space="preserve">Wed Dec 2</w:t>
             </w:r>
           </w:p>
         </w:tc>
@@ -4605,7 +4605,7 @@
                 <w:sz w:val="18"/>
                 <w:szCs w:val="18"/>
               </w:rPr>
-              <w:t xml:space="preserve">Thu Nov 26</w:t>
+              <w:t xml:space="preserve">Thu Dec 3</w:t>
             </w:r>
           </w:p>
         </w:tc>
@@ -4632,7 +4632,7 @@
                 <w:sz w:val="18"/>
                 <w:szCs w:val="18"/>
               </w:rPr>
-              <w:t xml:space="preserve">Thu Nov 26</w:t>
+              <w:t xml:space="preserve">Thu Dec 3</w:t>
             </w:r>
           </w:p>
         </w:tc>
@@ -4663,7 +4663,7 @@
           <w:sz w:val="19"/>
           <w:szCs w:val="19"/>
         </w:rPr>
-        <w:t xml:space="preserve">* Public holidays in Chile during the course: Monday October 12 (Encuentro de Dos Mundos), Saturday October 31 and Sunday November 1. Online classes take place on holidays unless the teacher announces otherwise 48 hours in advance; in that case a make-up session or recording is offered.</w:t>
+        <w:t xml:space="preserve">* Public holidays in Chile during the course: Monday October 12 (Encuentro de Dos Mundos), Saturday October 31 and Sunday November 1. Because October 12 is a public holiday, Korean for Kids starts Monday, October 19 and ends Monday, December 7 (its 8 weeks run one week behind the other courses). All other online classes take place on holidays unless the teacher announces otherwise 48 hours in advance; in that case a make-up session or recording is offered.</w:t>
       </w:r>
     </w:p>
     <w:p>
@@ -4728,7 +4728,7 @@
                 <w:sz w:val="19"/>
                 <w:szCs w:val="19"/>
               </w:rPr>
-              <w:t xml:space="preserve">Until Sun, October 4</w:t>
+              <w:t xml:space="preserve">Until Sun, October 11</w:t>
             </w:r>
           </w:p>
         </w:tc>
@@ -4788,7 +4788,7 @@
                 <w:sz w:val="19"/>
                 <w:szCs w:val="19"/>
               </w:rPr>
-              <w:t xml:space="preserve">Week 1 · Oct 5–9</w:t>
+              <w:t xml:space="preserve">Week 1 · Oct 12–16</w:t>
             </w:r>
           </w:p>
         </w:tc>
@@ -4848,7 +4848,7 @@
                 <w:sz w:val="19"/>
                 <w:szCs w:val="19"/>
               </w:rPr>
-              <w:t xml:space="preserve">Week 4 · Oct 26–30</w:t>
+              <w:t xml:space="preserve">Week 4 · Nov 2–6</w:t>
             </w:r>
           </w:p>
         </w:tc>
@@ -4908,7 +4908,7 @@
                 <w:sz w:val="19"/>
                 <w:szCs w:val="19"/>
               </w:rPr>
-              <w:t xml:space="preserve">Week 8 · Nov 23–27</w:t>
+              <w:t xml:space="preserve">Week 8 · Nov 30 – Dec 4</w:t>
             </w:r>
           </w:p>
         </w:tc>
@@ -4934,7 +4934,7 @@
                 <w:sz w:val="20"/>
                 <w:szCs w:val="20"/>
               </w:rPr>
-              <w:t xml:space="preserve">Final session: exam / presentation + wrap-up.</w:t>
+              <w:t xml:space="preserve">Final session: exam / presentation + wrap-up (Kids: Monday, December 7).</w:t>
             </w:r>
           </w:p>
         </w:tc>
@@ -4968,7 +4968,7 @@
                 <w:sz w:val="19"/>
                 <w:szCs w:val="19"/>
               </w:rPr>
-              <w:t xml:space="preserve">Mon, November 30</w:t>
+              <w:t xml:space="preserve">Mon, December 7</w:t>
             </w:r>
           </w:p>
         </w:tc>
@@ -8392,7 +8392,7 @@
                 <w:sz w:val="20"/>
                 <w:szCs w:val="20"/>
               </w:rPr>
-              <w:t xml:space="preserve">Guiran · 기란</w:t>
+              <w:t xml:space="preserve">Kiran · 기란</w:t>
             </w:r>
           </w:p>
         </w:tc>
@@ -8632,7 +8632,7 @@
                 <w:sz w:val="20"/>
                 <w:szCs w:val="20"/>
               </w:rPr>
-              <w:t xml:space="preserve">Tue Oct 6 → Tue Nov 24 · Thu Oct 8 → Thu Nov 26</w:t>
+              <w:t xml:space="preserve">Tue Oct 13 → Tue Dec 1 · Thu Oct 15 → Thu Dec 3</w:t>
             </w:r>
           </w:p>
         </w:tc>
@@ -9624,7 +9624,7 @@
                 <w:sz w:val="19"/>
                 <w:szCs w:val="19"/>
               </w:rPr>
-              <w:t xml:space="preserve">Tue Oct 6 / Thu Oct 8</w:t>
+              <w:t xml:space="preserve">Tue Oct 13 / Thu Oct 15</w:t>
             </w:r>
           </w:p>
         </w:tc>
@@ -9735,7 +9735,7 @@
                 <w:sz w:val="19"/>
                 <w:szCs w:val="19"/>
               </w:rPr>
-              <w:t xml:space="preserve">Tue Oct 13 / Thu Oct 15</w:t>
+              <w:t xml:space="preserve">Tue Oct 20 / Thu Oct 22</w:t>
             </w:r>
           </w:p>
         </w:tc>
@@ -9846,7 +9846,7 @@
                 <w:sz w:val="19"/>
                 <w:szCs w:val="19"/>
               </w:rPr>
-              <w:t xml:space="preserve">Tue Oct 20 / Thu Oct 22</w:t>
+              <w:t xml:space="preserve">Tue Oct 27 / Thu Oct 29</w:t>
             </w:r>
           </w:p>
         </w:tc>
@@ -9957,7 +9957,7 @@
                 <w:sz w:val="19"/>
                 <w:szCs w:val="19"/>
               </w:rPr>
-              <w:t xml:space="preserve">Tue Oct 27 / Thu Oct 29</w:t>
+              <w:t xml:space="preserve">Tue Nov 3 / Thu Nov 5</w:t>
             </w:r>
           </w:p>
         </w:tc>
@@ -10068,7 +10068,7 @@
                 <w:sz w:val="19"/>
                 <w:szCs w:val="19"/>
               </w:rPr>
-              <w:t xml:space="preserve">Tue Nov 3 / Thu Nov 5</w:t>
+              <w:t xml:space="preserve">Tue Nov 10 / Thu Nov 12</w:t>
             </w:r>
           </w:p>
         </w:tc>
@@ -10179,7 +10179,7 @@
                 <w:sz w:val="19"/>
                 <w:szCs w:val="19"/>
               </w:rPr>
-              <w:t xml:space="preserve">Tue Nov 10 / Thu Nov 12</w:t>
+              <w:t xml:space="preserve">Tue Nov 17 / Thu Nov 19</w:t>
             </w:r>
           </w:p>
         </w:tc>
@@ -10290,7 +10290,7 @@
                 <w:sz w:val="19"/>
                 <w:szCs w:val="19"/>
               </w:rPr>
-              <w:t xml:space="preserve">Tue Nov 17 / Thu Nov 19</w:t>
+              <w:t xml:space="preserve">Tue Nov 24 / Thu Nov 26</w:t>
             </w:r>
           </w:p>
         </w:tc>
@@ -10401,7 +10401,7 @@
                 <w:sz w:val="19"/>
                 <w:szCs w:val="19"/>
               </w:rPr>
-              <w:t xml:space="preserve">Tue Nov 24 / Thu Nov 26</w:t>
+              <w:t xml:space="preserve">Tue Dec 1 / Thu Dec 3</w:t>
             </w:r>
           </w:p>
         </w:tc>
@@ -10492,7 +10492,7 @@
           <w:sz w:val="21"/>
           <w:szCs w:val="21"/>
         </w:rPr>
-        <w:t xml:space="preserve">Week 1 · Tue Oct 6 / Thu Oct 8 · 가나다라 I · The syllable</w:t>
+        <w:t xml:space="preserve">Week 1 · Tue Oct 13 / Thu Oct 15 · 가나다라 I · The syllable</w:t>
       </w:r>
     </w:p>
     <w:p>
@@ -10900,7 +10900,7 @@
           <w:sz w:val="21"/>
           <w:szCs w:val="21"/>
         </w:rPr>
-        <w:t xml:space="preserve">Week 2 · Tue Oct 13 / Thu Oct 15 · 가나다라 II + 안녕하세요</w:t>
+        <w:t xml:space="preserve">Week 2 · Tue Oct 20 / Thu Oct 22 · 가나다라 II + 안녕하세요</w:t>
       </w:r>
     </w:p>
     <w:p>
@@ -11334,7 +11334,7 @@
           <w:sz w:val="21"/>
           <w:szCs w:val="21"/>
         </w:rPr>
-        <w:t xml:space="preserve">Week 3 · Tue Oct 20 / Thu Oct 22 · 이게 뭐예요? · What is this?</w:t>
+        <w:t xml:space="preserve">Week 3 · Tue Oct 27 / Thu Oct 29 · 이게 뭐예요? · What is this?</w:t>
       </w:r>
     </w:p>
     <w:p>
@@ -11742,7 +11742,7 @@
           <w:sz w:val="21"/>
           <w:szCs w:val="21"/>
         </w:rPr>
-        <w:t xml:space="preserve">Week 4 · Tue Oct 27 / Thu Oct 29 · 우리 엄마예요 · My family</w:t>
+        <w:t xml:space="preserve">Week 4 · Tue Nov 3 / Thu Nov 5 · 우리 엄마예요 · My family</w:t>
       </w:r>
     </w:p>
     <w:p>
@@ -12176,7 +12176,7 @@
           <w:sz w:val="21"/>
           <w:szCs w:val="21"/>
         </w:rPr>
-        <w:t xml:space="preserve">Week 5 · Tue Nov 3 / Thu Nov 5 · 집이 어디예요? · Places</w:t>
+        <w:t xml:space="preserve">Week 5 · Tue Nov 10 / Thu Nov 12 · 집이 어디예요? · Places</w:t>
       </w:r>
     </w:p>
     <w:p>
@@ -12610,7 +12610,7 @@
           <w:sz w:val="21"/>
           <w:szCs w:val="21"/>
         </w:rPr>
-        <w:t xml:space="preserve">Week 6 · Tue Nov 10 / Thu Nov 12 · 학교에 가요 · My day</w:t>
+        <w:t xml:space="preserve">Week 6 · Tue Nov 17 / Thu Nov 19 · 학교에 가요 · My day</w:t>
       </w:r>
     </w:p>
     <w:p>
@@ -13044,7 +13044,7 @@
           <w:sz w:val="21"/>
           <w:szCs w:val="21"/>
         </w:rPr>
-        <w:t xml:space="preserve">Week 7 · Tue Nov 17 / Thu Nov 19 · My room and my verbs</w:t>
+        <w:t xml:space="preserve">Week 7 · Tue Nov 24 / Thu Nov 26 · My room and my verbs</w:t>
       </w:r>
     </w:p>
     <w:p>
@@ -13478,7 +13478,7 @@
           <w:sz w:val="21"/>
           <w:szCs w:val="21"/>
         </w:rPr>
-        <w:t xml:space="preserve">Week 8 · Tue Nov 24 / Thu Nov 26 · 사과를 좋아해요 + exam</w:t>
+        <w:t xml:space="preserve">Week 8 · Tue Dec 1 / Thu Dec 3 · 사과를 좋아해요 + exam</w:t>
       </w:r>
     </w:p>
     <w:p>
@@ -15177,7 +15177,7 @@
                 <w:sz w:val="20"/>
                 <w:szCs w:val="20"/>
               </w:rPr>
-              <w:t xml:space="preserve">Wed Oct 7 → Wed Nov 25</w:t>
+              <w:t xml:space="preserve">Wed Oct 14 → Wed Dec 2</w:t>
             </w:r>
           </w:p>
         </w:tc>
@@ -16143,7 +16143,7 @@
                 <w:sz w:val="19"/>
                 <w:szCs w:val="19"/>
               </w:rPr>
-              <w:t xml:space="preserve">Wed Oct 7</w:t>
+              <w:t xml:space="preserve">Wed Oct 14</w:t>
             </w:r>
           </w:p>
         </w:tc>
@@ -16254,7 +16254,7 @@
                 <w:sz w:val="19"/>
                 <w:szCs w:val="19"/>
               </w:rPr>
-              <w:t xml:space="preserve">Wed Oct 14</w:t>
+              <w:t xml:space="preserve">Wed Oct 21</w:t>
             </w:r>
           </w:p>
         </w:tc>
@@ -16365,7 +16365,7 @@
                 <w:sz w:val="19"/>
                 <w:szCs w:val="19"/>
               </w:rPr>
-              <w:t xml:space="preserve">Wed Oct 21</w:t>
+              <w:t xml:space="preserve">Wed Oct 28</w:t>
             </w:r>
           </w:p>
         </w:tc>
@@ -16476,7 +16476,7 @@
                 <w:sz w:val="19"/>
                 <w:szCs w:val="19"/>
               </w:rPr>
-              <w:t xml:space="preserve">Wed Oct 28</w:t>
+              <w:t xml:space="preserve">Wed Nov 4</w:t>
             </w:r>
           </w:p>
         </w:tc>
@@ -16587,7 +16587,7 @@
                 <w:sz w:val="19"/>
                 <w:szCs w:val="19"/>
               </w:rPr>
-              <w:t xml:space="preserve">Wed Nov 4</w:t>
+              <w:t xml:space="preserve">Wed Nov 11</w:t>
             </w:r>
           </w:p>
         </w:tc>
@@ -16698,7 +16698,7 @@
                 <w:sz w:val="19"/>
                 <w:szCs w:val="19"/>
               </w:rPr>
-              <w:t xml:space="preserve">Wed Nov 11</w:t>
+              <w:t xml:space="preserve">Wed Nov 18</w:t>
             </w:r>
           </w:p>
         </w:tc>
@@ -16809,7 +16809,7 @@
                 <w:sz w:val="19"/>
                 <w:szCs w:val="19"/>
               </w:rPr>
-              <w:t xml:space="preserve">Wed Nov 18</w:t>
+              <w:t xml:space="preserve">Wed Nov 25</w:t>
             </w:r>
           </w:p>
         </w:tc>
@@ -16920,7 +16920,7 @@
                 <w:sz w:val="19"/>
                 <w:szCs w:val="19"/>
               </w:rPr>
-              <w:t xml:space="preserve">Wed Nov 25</w:t>
+              <w:t xml:space="preserve">Wed Dec 2</w:t>
             </w:r>
           </w:p>
         </w:tc>
@@ -17011,7 +17011,7 @@
           <w:sz w:val="21"/>
           <w:szCs w:val="21"/>
         </w:rPr>
-        <w:t xml:space="preserve">Week 1 · Wed Oct 7 · Re-introductions + diagnostic</w:t>
+        <w:t xml:space="preserve">Week 1 · Wed Oct 14 · Re-introductions + diagnostic</w:t>
       </w:r>
     </w:p>
     <w:p>
@@ -17036,7 +17036,7 @@
           <w:sz w:val="20"/>
           <w:szCs w:val="20"/>
         </w:rPr>
-        <w:t xml:space="preserve">Wednesday, October 7 · Textbook Fundamentals 01–02: 이다 (to be) and 있다 (there is / to have / to be located) · active review of Basic 1 · individual oral diagnostic</w:t>
+        <w:t xml:space="preserve">Wednesday, October 14 · Textbook Fundamentals 01–02: 이다 (to be) and 있다 (there is / to have / to be located) · active review of Basic 1 · individual oral diagnostic</w:t>
       </w:r>
       <w:r>
         <w:rPr>
@@ -17445,7 +17445,7 @@
           <w:sz w:val="21"/>
           <w:szCs w:val="21"/>
         </w:rPr>
-        <w:t xml:space="preserve">Week 2 · Wed Oct 14 · Numbers in action</w:t>
+        <w:t xml:space="preserve">Week 2 · Wed Oct 21 · Numbers in action</w:t>
       </w:r>
     </w:p>
     <w:p>
@@ -17470,7 +17470,7 @@
           <w:sz w:val="20"/>
           <w:szCs w:val="20"/>
         </w:rPr>
-        <w:t xml:space="preserve">Wednesday, October 14 · Textbook Fundamentals 03–05: Sino-Korean and native Korean numerals · dates and days of the week · telling time (몇 시)</w:t>
+        <w:t xml:space="preserve">Wednesday, October 21 · Textbook Fundamentals 03–05: Sino-Korean and native Korean numerals · dates and days of the week · telling time (몇 시)</w:t>
       </w:r>
       <w:r>
         <w:rPr>
@@ -17879,7 +17879,7 @@
           <w:sz w:val="21"/>
           <w:szCs w:val="21"/>
         </w:rPr>
-        <w:t xml:space="preserve">Week 3 · Wed Oct 21 · The full present tense</w:t>
+        <w:t xml:space="preserve">Week 3 · Wed Oct 28 · The full present tense</w:t>
       </w:r>
     </w:p>
     <w:p>
@@ -17904,7 +17904,7 @@
           <w:sz w:val="20"/>
           <w:szCs w:val="20"/>
         </w:rPr>
-        <w:t xml:space="preserve">Wednesday, October 21 · Textbook Tenses unit 01–02: the full polite present -아요/어요 and the formal present -ㅂ니다/습니다 · everyday irregular verbs · the particle 에서 vs. 에</w:t>
+        <w:t xml:space="preserve">Wednesday, October 28 · Textbook Tenses unit 01–02: the full polite present -아요/어요 and the formal present -ㅂ니다/습니다 · everyday irregular verbs · the particle 에서 vs. 에</w:t>
       </w:r>
       <w:r>
         <w:rPr>
@@ -18313,7 +18313,7 @@
           <w:sz w:val="21"/>
           <w:szCs w:val="21"/>
         </w:rPr>
-        <w:t xml:space="preserve">Week 4 · Wed Oct 28 · The past · -았/었어요</w:t>
+        <w:t xml:space="preserve">Week 4 · Wed Nov 4 · The past · -았/었어요</w:t>
       </w:r>
     </w:p>
     <w:p>
@@ -18338,7 +18338,7 @@
           <w:sz w:val="20"/>
           <w:szCs w:val="20"/>
         </w:rPr>
-        <w:t xml:space="preserve">Wednesday, October 28 · Textbook Tenses unit 03: past tense -았어요/었어요 · Particles unit 08: 부터~까지 (from… to) · past time expressions · 하고 / (이)랑 (with whom)</w:t>
+        <w:t xml:space="preserve">Wednesday, November 4 · Textbook Tenses unit 03: past tense -았어요/었어요 · Particles unit 08: 부터~까지 (from… to) · past time expressions · 하고 / (이)랑 (with whom)</w:t>
       </w:r>
       <w:r>
         <w:rPr>
@@ -18747,7 +18747,7 @@
           <w:sz w:val="21"/>
           <w:szCs w:val="21"/>
         </w:rPr>
-        <w:t xml:space="preserve">Week 5 · Wed Nov 4 · The future · -(으)ㄹ 거예요</w:t>
+        <w:t xml:space="preserve">Week 5 · Wed Nov 11 · The future · -(으)ㄹ 거예요</w:t>
       </w:r>
     </w:p>
     <w:p>
@@ -18772,7 +18772,7 @@
           <w:sz w:val="20"/>
           <w:szCs w:val="20"/>
         </w:rPr>
-        <w:t xml:space="preserve">Wednesday, November 4 · Textbook Tenses unit 04: future and intention -(으)ㄹ 거예요 · Listing and contrast unit 02: -거나 (or) · Particles 13: (으)로 (means of transportation)</w:t>
+        <w:t xml:space="preserve">Wednesday, November 11 · Textbook Tenses unit 04: future and intention -(으)ㄹ 거예요 · Listing and contrast unit 02: -거나 (or) · Particles 13: (으)로 (means of transportation)</w:t>
       </w:r>
       <w:r>
         <w:rPr>
@@ -19181,7 +19181,7 @@
           <w:sz w:val="21"/>
           <w:szCs w:val="21"/>
         </w:rPr>
-        <w:t xml:space="preserve">Week 6 · Wed Nov 11 · Negation and ability</w:t>
+        <w:t xml:space="preserve">Week 6 · Wed Nov 18 · Negation and ability</w:t>
       </w:r>
     </w:p>
     <w:p>
@@ -19206,7 +19206,7 @@
           <w:sz w:val="20"/>
           <w:szCs w:val="20"/>
         </w:rPr>
-        <w:t xml:space="preserve">Wednesday, November 11 · Textbook Negation unit 01–03: 안 / -지 않아요 · 못 / -지 못해요 · negatives that are words of their own · Ability unit 01: -(으)ㄹ 수 있어요/없어요</w:t>
+        <w:t xml:space="preserve">Wednesday, November 18 · Textbook Negation unit 01–03: 안 / -지 않아요 · 못 / -지 못해요 · negatives that are words of their own · Ability unit 01: -(으)ㄹ 수 있어요/없어요</w:t>
       </w:r>
       <w:r>
         <w:rPr>
@@ -19615,7 +19615,7 @@
           <w:sz w:val="21"/>
           <w:szCs w:val="21"/>
         </w:rPr>
-        <w:t xml:space="preserve">Week 7 · Wed Nov 18 · Pro particles</w:t>
+        <w:t xml:space="preserve">Week 7 · Wed Nov 25 · Pro particles</w:t>
       </w:r>
     </w:p>
     <w:p>
@@ -19640,7 +19640,7 @@
           <w:sz w:val="20"/>
           <w:szCs w:val="20"/>
         </w:rPr>
-        <w:t xml:space="preserve">Wednesday, November 18 · Textbook Particles unit (selection): 05 의 · 09 에게/한테 · 10 도 · 11 만 · 12 밖에 · 14 쯤 · 15 처럼 · 16 보다 · 17 마다</w:t>
+        <w:t xml:space="preserve">Wednesday, November 25 · Textbook Particles unit (selection): 05 의 · 09 에게/한테 · 10 도 · 11 만 · 12 밖에 · 14 쯤 · 15 처럼 · 16 보다 · 17 마다</w:t>
       </w:r>
       <w:r>
         <w:rPr>
@@ -20049,7 +20049,7 @@
           <w:sz w:val="21"/>
           <w:szCs w:val="21"/>
         </w:rPr>
-        <w:t xml:space="preserve">Week 8 · Wed Nov 25 · Connectors + A2 exam</w:t>
+        <w:t xml:space="preserve">Week 8 · Wed Dec 2 · Connectors + A2 exam</w:t>
       </w:r>
     </w:p>
     <w:p>
@@ -20074,7 +20074,7 @@
           <w:sz w:val="20"/>
           <w:szCs w:val="20"/>
         </w:rPr>
-        <w:t xml:space="preserve">Wednesday, November 25 · Textbook Listing and contrast unit 01 and 03: -고 (and) · -지만 (but) · integration of the 7 classes · in-house A2 exam + oral assessment · certificate</w:t>
+        <w:t xml:space="preserve">Wednesday, December 2 · Textbook Listing and contrast unit 01 and 03: -고 (and) · -지만 (but) · integration of the 7 classes · in-house A2 exam + oral assessment · certificate</w:t>
       </w:r>
       <w:r>
         <w:rPr>
@@ -21042,7 +21042,7 @@
           <w:sz w:val="22"/>
           <w:szCs w:val="22"/>
         </w:rPr>
-        <w:t xml:space="preserve">The group arrives mixed (Guiran's Basic 1, the July Level 1 and someone via placement test): use the class 1 oral diagnostic to set up 'strong + medium' pairs, never 'strong + strong', and don't re-explain Hangul live; send slow readers to the Reader with a concrete goal.</w:t>
+        <w:t xml:space="preserve">The group arrives mixed (Kiran's Basic 1, the July Level 1 and someone via placement test): use the class 1 oral diagnostic to set up 'strong + medium' pairs, never 'strong + strong', and don't re-explain Hangul live; send slow readers to the Reader with a concrete goal.</w:t>
       </w:r>
     </w:p>
     <w:p>
@@ -21748,7 +21748,7 @@
                 <w:sz w:val="20"/>
                 <w:szCs w:val="20"/>
               </w:rPr>
-              <w:t xml:space="preserve">Tue Oct 6 → Tue Nov 24</w:t>
+              <w:t xml:space="preserve">Tue Oct 13 → Tue Dec 1</w:t>
             </w:r>
           </w:p>
         </w:tc>
@@ -22740,7 +22740,7 @@
                 <w:sz w:val="19"/>
                 <w:szCs w:val="19"/>
               </w:rPr>
-              <w:t xml:space="preserve">Tue Oct 6</w:t>
+              <w:t xml:space="preserve">Tue Oct 13</w:t>
             </w:r>
           </w:p>
         </w:tc>
@@ -22851,7 +22851,7 @@
                 <w:sz w:val="19"/>
                 <w:szCs w:val="19"/>
               </w:rPr>
-              <w:t xml:space="preserve">Tue Oct 13</w:t>
+              <w:t xml:space="preserve">Tue Oct 20</w:t>
             </w:r>
           </w:p>
         </w:tc>
@@ -22962,7 +22962,7 @@
                 <w:sz w:val="19"/>
                 <w:szCs w:val="19"/>
               </w:rPr>
-              <w:t xml:space="preserve">Tue Oct 20</w:t>
+              <w:t xml:space="preserve">Tue Oct 27</w:t>
             </w:r>
           </w:p>
         </w:tc>
@@ -23073,7 +23073,7 @@
                 <w:sz w:val="19"/>
                 <w:szCs w:val="19"/>
               </w:rPr>
-              <w:t xml:space="preserve">Tue Oct 27</w:t>
+              <w:t xml:space="preserve">Tue Nov 3</w:t>
             </w:r>
           </w:p>
         </w:tc>
@@ -23184,7 +23184,7 @@
                 <w:sz w:val="19"/>
                 <w:szCs w:val="19"/>
               </w:rPr>
-              <w:t xml:space="preserve">Tue Nov 3</w:t>
+              <w:t xml:space="preserve">Tue Nov 10</w:t>
             </w:r>
           </w:p>
         </w:tc>
@@ -23295,7 +23295,7 @@
                 <w:sz w:val="19"/>
                 <w:szCs w:val="19"/>
               </w:rPr>
-              <w:t xml:space="preserve">Tue Nov 10</w:t>
+              <w:t xml:space="preserve">Tue Nov 17</w:t>
             </w:r>
           </w:p>
         </w:tc>
@@ -23406,7 +23406,7 @@
                 <w:sz w:val="19"/>
                 <w:szCs w:val="19"/>
               </w:rPr>
-              <w:t xml:space="preserve">Tue Nov 17</w:t>
+              <w:t xml:space="preserve">Tue Nov 24</w:t>
             </w:r>
           </w:p>
         </w:tc>
@@ -23517,7 +23517,7 @@
                 <w:sz w:val="19"/>
                 <w:szCs w:val="19"/>
               </w:rPr>
-              <w:t xml:space="preserve">Tue Nov 24</w:t>
+              <w:t xml:space="preserve">Tue Dec 1</w:t>
             </w:r>
           </w:p>
         </w:tc>
@@ -23608,7 +23608,7 @@
           <w:sz w:val="21"/>
           <w:szCs w:val="21"/>
         </w:rPr>
-        <w:t xml:space="preserve">Week 1 · Tue Oct 6 · Orientation + oral diagnostic</w:t>
+        <w:t xml:space="preserve">Week 1 · Tue Oct 13 · Orientation + oral diagnostic</w:t>
       </w:r>
     </w:p>
     <w:p>
@@ -23633,7 +23633,7 @@
           <w:sz w:val="20"/>
           <w:szCs w:val="20"/>
         </w:rPr>
-        <w:t xml:space="preserve">Tuesday, October 6 · Orientation session (no themed module) · individual oral diagnostic</w:t>
+        <w:t xml:space="preserve">Tuesday, October 13 · Orientation session (no themed module) · individual oral diagnostic</w:t>
       </w:r>
       <w:r>
         <w:rPr>
@@ -24042,7 +24042,7 @@
           <w:sz w:val="21"/>
           <w:szCs w:val="21"/>
         </w:rPr>
-        <w:t xml:space="preserve">Week 2 · Tue Oct 13 · K-pop and fan culture</w:t>
+        <w:t xml:space="preserve">Week 2 · Tue Oct 20 · K-pop and fan culture</w:t>
       </w:r>
     </w:p>
     <w:p>
@@ -24067,7 +24067,7 @@
           <w:sz w:val="20"/>
           <w:szCs w:val="20"/>
         </w:rPr>
-        <w:t xml:space="preserve">Tuesday, October 13 · M01 · K-pop and fan culture (in-house trilingual deck)</w:t>
+        <w:t xml:space="preserve">Tuesday, October 20 · M01 · K-pop and fan culture (in-house trilingual deck)</w:t>
       </w:r>
       <w:r>
         <w:rPr>
@@ -24476,7 +24476,7 @@
           <w:sz w:val="21"/>
           <w:szCs w:val="21"/>
         </w:rPr>
-        <w:t xml:space="preserve">Week 3 · Tue Oct 20 · Travel: Jeju and Seoul</w:t>
+        <w:t xml:space="preserve">Week 3 · Tue Oct 27 · Travel: Jeju and Seoul</w:t>
       </w:r>
     </w:p>
     <w:p>
@@ -24501,7 +24501,7 @@
           <w:sz w:val="20"/>
           <w:szCs w:val="20"/>
         </w:rPr>
-        <w:t xml:space="preserve">Tuesday, October 20 · M02 · Travel: Jeju and Seoul (in-house trilingual deck)</w:t>
+        <w:t xml:space="preserve">Tuesday, October 27 · M02 · Travel: Jeju and Seoul (in-house trilingual deck)</w:t>
       </w:r>
       <w:r>
         <w:rPr>
@@ -24910,7 +24910,7 @@
           <w:sz w:val="21"/>
           <w:szCs w:val="21"/>
         </w:rPr>
-        <w:t xml:space="preserve">Week 4 · Tue Oct 27 · Food culture</w:t>
+        <w:t xml:space="preserve">Week 4 · Tue Nov 3 · Food culture</w:t>
       </w:r>
     </w:p>
     <w:p>
@@ -24935,7 +24935,7 @@
           <w:sz w:val="20"/>
           <w:szCs w:val="20"/>
         </w:rPr>
-        <w:t xml:space="preserve">Tuesday, October 27 · M03 · Food culture (in-house trilingual deck)</w:t>
+        <w:t xml:space="preserve">Tuesday, November 3 · M03 · Food culture (in-house trilingual deck)</w:t>
       </w:r>
       <w:r>
         <w:rPr>
@@ -25344,7 +25344,7 @@
           <w:sz w:val="21"/>
           <w:szCs w:val="21"/>
         </w:rPr>
-        <w:t xml:space="preserve">Week 5 · Tue Nov 3 · Conversation Lab 1</w:t>
+        <w:t xml:space="preserve">Week 5 · Tue Nov 10 · Conversation Lab 1</w:t>
       </w:r>
     </w:p>
     <w:p>
@@ -25369,7 +25369,7 @@
           <w:sz w:val="20"/>
           <w:szCs w:val="20"/>
         </w:rPr>
-        <w:t xml:space="preserve">Tuesday, November 3 · Lab 1 · integrates M01–M03 (K-pop, travel, food) · no new deck</w:t>
+        <w:t xml:space="preserve">Tuesday, November 10 · Lab 1 · integrates M01–M03 (K-pop, travel, food) · no new deck</w:t>
       </w:r>
       <w:r>
         <w:rPr>
@@ -25778,7 +25778,7 @@
           <w:sz w:val="21"/>
           <w:szCs w:val="21"/>
         </w:rPr>
-        <w:t xml:space="preserve">Week 6 · Tue Nov 10 · Hanbok and aesthetics</w:t>
+        <w:t xml:space="preserve">Week 6 · Tue Nov 17 · Hanbok and aesthetics</w:t>
       </w:r>
     </w:p>
     <w:p>
@@ -25803,7 +25803,7 @@
           <w:sz w:val="20"/>
           <w:szCs w:val="20"/>
         </w:rPr>
-        <w:t xml:space="preserve">Tuesday, November 10 · M04 · Hanbok and aesthetics (in-house trilingual deck)</w:t>
+        <w:t xml:space="preserve">Tuesday, November 17 · M04 · Hanbok and aesthetics (in-house trilingual deck)</w:t>
       </w:r>
       <w:r>
         <w:rPr>
@@ -26212,7 +26212,7 @@
           <w:sz w:val="21"/>
           <w:szCs w:val="21"/>
         </w:rPr>
-        <w:t xml:space="preserve">Week 7 · Tue Nov 17 · PC방 and e-sports</w:t>
+        <w:t xml:space="preserve">Week 7 · Tue Nov 24 · PC방 and e-sports</w:t>
       </w:r>
     </w:p>
     <w:p>
@@ -26237,7 +26237,7 @@
           <w:sz w:val="20"/>
           <w:szCs w:val="20"/>
         </w:rPr>
-        <w:t xml:space="preserve">Tuesday, November 17 · M05 · PC방 and e-sports (in-house trilingual deck)</w:t>
+        <w:t xml:space="preserve">Tuesday, November 24 · M05 · PC방 and e-sports (in-house trilingual deck)</w:t>
       </w:r>
       <w:r>
         <w:rPr>
@@ -26646,7 +26646,7 @@
           <w:sz w:val="21"/>
           <w:szCs w:val="21"/>
         </w:rPr>
-        <w:t xml:space="preserve">Week 8 · Tue Nov 24 · Lab 2 + oral assessment</w:t>
+        <w:t xml:space="preserve">Week 8 · Tue Dec 1 · Lab 2 + oral assessment</w:t>
       </w:r>
     </w:p>
     <w:p>
@@ -26671,7 +26671,7 @@
           <w:sz w:val="20"/>
           <w:szCs w:val="20"/>
         </w:rPr>
-        <w:t xml:space="preserve">Tuesday, November 24 · Lab 2 (M01–M05) + end-of-stage oral assessment · certificate and invitation to Conversational 2</w:t>
+        <w:t xml:space="preserve">Tuesday, December 1 · Lab 2 (M01–M05) + end-of-stage oral assessment · certificate and invitation to Conversational 2</w:t>
       </w:r>
       <w:r>
         <w:rPr>
@@ -28345,7 +28345,7 @@
                 <w:sz w:val="20"/>
                 <w:szCs w:val="20"/>
               </w:rPr>
-              <w:t xml:space="preserve">Thu Oct 8 → Thu Nov 26</w:t>
+              <w:t xml:space="preserve">Thu Oct 15 → Thu Dec 3</w:t>
             </w:r>
           </w:p>
         </w:tc>
@@ -29311,7 +29311,7 @@
                 <w:sz w:val="19"/>
                 <w:szCs w:val="19"/>
               </w:rPr>
-              <w:t xml:space="preserve">Thu Oct 8</w:t>
+              <w:t xml:space="preserve">Thu Oct 15</w:t>
             </w:r>
           </w:p>
         </w:tc>
@@ -29422,7 +29422,7 @@
                 <w:sz w:val="19"/>
                 <w:szCs w:val="19"/>
               </w:rPr>
-              <w:t xml:space="preserve">Thu Oct 15</w:t>
+              <w:t xml:space="preserve">Thu Oct 22</w:t>
             </w:r>
           </w:p>
         </w:tc>
@@ -29533,7 +29533,7 @@
                 <w:sz w:val="19"/>
                 <w:szCs w:val="19"/>
               </w:rPr>
-              <w:t xml:space="preserve">Thu Oct 22</w:t>
+              <w:t xml:space="preserve">Thu Oct 29</w:t>
             </w:r>
           </w:p>
         </w:tc>
@@ -29644,7 +29644,7 @@
                 <w:sz w:val="19"/>
                 <w:szCs w:val="19"/>
               </w:rPr>
-              <w:t xml:space="preserve">Thu Oct 29</w:t>
+              <w:t xml:space="preserve">Thu Nov 5</w:t>
             </w:r>
           </w:p>
         </w:tc>
@@ -29755,7 +29755,7 @@
                 <w:sz w:val="19"/>
                 <w:szCs w:val="19"/>
               </w:rPr>
-              <w:t xml:space="preserve">Thu Nov 5</w:t>
+              <w:t xml:space="preserve">Thu Nov 12</w:t>
             </w:r>
           </w:p>
         </w:tc>
@@ -29866,7 +29866,7 @@
                 <w:sz w:val="19"/>
                 <w:szCs w:val="19"/>
               </w:rPr>
-              <w:t xml:space="preserve">Thu Nov 12</w:t>
+              <w:t xml:space="preserve">Thu Nov 19</w:t>
             </w:r>
           </w:p>
         </w:tc>
@@ -29977,7 +29977,7 @@
                 <w:sz w:val="19"/>
                 <w:szCs w:val="19"/>
               </w:rPr>
-              <w:t xml:space="preserve">Thu Nov 19</w:t>
+              <w:t xml:space="preserve">Thu Nov 26</w:t>
             </w:r>
           </w:p>
         </w:tc>
@@ -30088,7 +30088,7 @@
                 <w:sz w:val="19"/>
                 <w:szCs w:val="19"/>
               </w:rPr>
-              <w:t xml:space="preserve">Thu Nov 26</w:t>
+              <w:t xml:space="preserve">Thu Dec 3</w:t>
             </w:r>
           </w:p>
         </w:tc>
@@ -30179,7 +30179,7 @@
           <w:sz w:val="21"/>
           <w:szCs w:val="21"/>
         </w:rPr>
-        <w:t xml:space="preserve">Week 1 · Thu Oct 8 · Diagnostic + anatomy of TOPIK II</w:t>
+        <w:t xml:space="preserve">Week 1 · Thu Oct 15 · Diagnostic + anatomy of TOPIK II</w:t>
       </w:r>
     </w:p>
     <w:p>
@@ -30587,7 +30587,7 @@
           <w:sz w:val="21"/>
           <w:szCs w:val="21"/>
         </w:rPr>
-        <w:t xml:space="preserve">Week 2 · Thu Oct 15 · 읽기 I · Reading</w:t>
+        <w:t xml:space="preserve">Week 2 · Thu Oct 22 · 읽기 I · Reading</w:t>
       </w:r>
     </w:p>
     <w:p>
@@ -31021,7 +31021,7 @@
           <w:sz w:val="21"/>
           <w:szCs w:val="21"/>
         </w:rPr>
-        <w:t xml:space="preserve">Week 3 · Thu Oct 22 · 듣기 I · Listening</w:t>
+        <w:t xml:space="preserve">Week 3 · Thu Oct 29 · 듣기 I · Listening</w:t>
       </w:r>
     </w:p>
     <w:p>
@@ -31455,7 +31455,7 @@
           <w:sz w:val="21"/>
           <w:szCs w:val="21"/>
         </w:rPr>
-        <w:t xml:space="preserve">Week 4 · Thu Oct 29 · 쓰기 51–52</w:t>
+        <w:t xml:space="preserve">Week 4 · Thu Nov 5 · 쓰기 51–52</w:t>
       </w:r>
     </w:p>
     <w:p>
@@ -31889,7 +31889,7 @@
           <w:sz w:val="21"/>
           <w:szCs w:val="21"/>
         </w:rPr>
-        <w:t xml:space="preserve">Week 5 · Thu Nov 5 · 쓰기 53 · The graph</w:t>
+        <w:t xml:space="preserve">Week 5 · Thu Nov 12 · 쓰기 53 · The graph</w:t>
       </w:r>
     </w:p>
     <w:p>
@@ -32323,7 +32323,7 @@
           <w:sz w:val="21"/>
           <w:szCs w:val="21"/>
         </w:rPr>
-        <w:t xml:space="preserve">Week 6 · Thu Nov 12 · 읽기/듣기 II · Level 4–6</w:t>
+        <w:t xml:space="preserve">Week 6 · Thu Nov 19 · 읽기/듣기 II · Level 4–6</w:t>
       </w:r>
     </w:p>
     <w:p>
@@ -32757,7 +32757,7 @@
           <w:sz w:val="21"/>
           <w:szCs w:val="21"/>
         </w:rPr>
-        <w:t xml:space="preserve">Week 7 · Thu Nov 19 · 쓰기 54 · The essay</w:t>
+        <w:t xml:space="preserve">Week 7 · Thu Nov 26 · 쓰기 54 · The essay</w:t>
       </w:r>
     </w:p>
     <w:p>
@@ -33191,7 +33191,7 @@
           <w:sz w:val="21"/>
           <w:szCs w:val="21"/>
         </w:rPr>
-        <w:t xml:space="preserve">Week 8 · Thu Nov 26 · Final mock exam + personal plan</w:t>
+        <w:t xml:space="preserve">Week 8 · Thu Dec 3 · Final mock exam + personal plan</w:t>
       </w:r>
     </w:p>
     <w:p>
@@ -34916,7 +34916,7 @@
                 <w:sz w:val="20"/>
                 <w:szCs w:val="20"/>
               </w:rPr>
-              <w:t xml:space="preserve">Mon Oct 5 → Mon Nov 23</w:t>
+              <w:t xml:space="preserve">Mon Oct 19 → Mon Dec 7</w:t>
             </w:r>
           </w:p>
         </w:tc>
@@ -35908,7 +35908,7 @@
                 <w:sz w:val="19"/>
                 <w:szCs w:val="19"/>
               </w:rPr>
-              <w:t xml:space="preserve">Mon Oct 5</w:t>
+              <w:t xml:space="preserve">Mon Oct 19</w:t>
             </w:r>
           </w:p>
         </w:tc>
@@ -36019,7 +36019,7 @@
                 <w:sz w:val="19"/>
                 <w:szCs w:val="19"/>
               </w:rPr>
-              <w:t xml:space="preserve">Mon Oct 12</w:t>
+              <w:t xml:space="preserve">Mon Oct 26</w:t>
             </w:r>
           </w:p>
         </w:tc>
@@ -36130,7 +36130,7 @@
                 <w:sz w:val="19"/>
                 <w:szCs w:val="19"/>
               </w:rPr>
-              <w:t xml:space="preserve">Mon Oct 19</w:t>
+              <w:t xml:space="preserve">Mon Nov 2</w:t>
             </w:r>
           </w:p>
         </w:tc>
@@ -36241,7 +36241,7 @@
                 <w:sz w:val="19"/>
                 <w:szCs w:val="19"/>
               </w:rPr>
-              <w:t xml:space="preserve">Mon Oct 26</w:t>
+              <w:t xml:space="preserve">Mon Nov 9</w:t>
             </w:r>
           </w:p>
         </w:tc>
@@ -36352,7 +36352,7 @@
                 <w:sz w:val="19"/>
                 <w:szCs w:val="19"/>
               </w:rPr>
-              <w:t xml:space="preserve">Mon Nov 2</w:t>
+              <w:t xml:space="preserve">Mon Nov 16</w:t>
             </w:r>
           </w:p>
         </w:tc>
@@ -36463,7 +36463,7 @@
                 <w:sz w:val="19"/>
                 <w:szCs w:val="19"/>
               </w:rPr>
-              <w:t xml:space="preserve">Mon Nov 9</w:t>
+              <w:t xml:space="preserve">Mon Nov 23</w:t>
             </w:r>
           </w:p>
         </w:tc>
@@ -36574,7 +36574,7 @@
                 <w:sz w:val="19"/>
                 <w:szCs w:val="19"/>
               </w:rPr>
-              <w:t xml:space="preserve">Mon Nov 16</w:t>
+              <w:t xml:space="preserve">Mon Nov 30</w:t>
             </w:r>
           </w:p>
         </w:tc>
@@ -36685,7 +36685,7 @@
                 <w:sz w:val="19"/>
                 <w:szCs w:val="19"/>
               </w:rPr>
-              <w:t xml:space="preserve">Mon Nov 23</w:t>
+              <w:t xml:space="preserve">Mon Dec 7</w:t>
             </w:r>
           </w:p>
         </w:tc>
@@ -36776,7 +36776,7 @@
           <w:sz w:val="21"/>
           <w:szCs w:val="21"/>
         </w:rPr>
-        <w:t xml:space="preserve">Week 1 · Mon Oct 5 · Hello, Korea! · 안녕하세요</w:t>
+        <w:t xml:space="preserve">Week 1 · Mon Oct 19 · Hello, Korea! · 안녕하세요</w:t>
       </w:r>
     </w:p>
     <w:p>
@@ -37184,7 +37184,7 @@
           <w:sz w:val="21"/>
           <w:szCs w:val="21"/>
         </w:rPr>
-        <w:t xml:space="preserve">Week 2 · Mon Oct 12 · My name in Korean</w:t>
+        <w:t xml:space="preserve">Week 2 · Mon Oct 26 · My name in Korean</w:t>
       </w:r>
     </w:p>
     <w:p>
@@ -37592,7 +37592,7 @@
           <w:sz w:val="21"/>
           <w:szCs w:val="21"/>
         </w:rPr>
-        <w:t xml:space="preserve">Week 3 · Mon Oct 19 · The syllable factory</w:t>
+        <w:t xml:space="preserve">Week 3 · Mon Nov 2 · The syllable factory</w:t>
       </w:r>
     </w:p>
     <w:p>
@@ -38000,7 +38000,7 @@
           <w:sz w:val="21"/>
           <w:szCs w:val="21"/>
         </w:rPr>
-        <w:t xml:space="preserve">Week 4 · Mon Oct 26 · Animals · 동물</w:t>
+        <w:t xml:space="preserve">Week 4 · Mon Nov 9 · Animals · 동물</w:t>
       </w:r>
     </w:p>
     <w:p>
@@ -38408,7 +38408,7 @@
           <w:sz w:val="21"/>
           <w:szCs w:val="21"/>
         </w:rPr>
-        <w:t xml:space="preserve">Week 5 · Mon Nov 2 · My family · 가족</w:t>
+        <w:t xml:space="preserve">Week 5 · Mon Nov 16 · My family · 가족</w:t>
       </w:r>
     </w:p>
     <w:p>
@@ -38816,7 +38816,7 @@
           <w:sz w:val="21"/>
           <w:szCs w:val="21"/>
         </w:rPr>
-        <w:t xml:space="preserve">Week 6 · Mon Nov 9 · The magic numbers</w:t>
+        <w:t xml:space="preserve">Week 6 · Mon Nov 23 · The magic numbers</w:t>
       </w:r>
     </w:p>
     <w:p>
@@ -39224,7 +39224,7 @@
           <w:sz w:val="21"/>
           <w:szCs w:val="21"/>
         </w:rPr>
-        <w:t xml:space="preserve">Week 7 · Mon Nov 16 · Yum! Korean food</w:t>
+        <w:t xml:space="preserve">Week 7 · Mon Nov 30 · Yum! Korean food</w:t>
       </w:r>
     </w:p>
     <w:p>
@@ -39632,7 +39632,7 @@
           <w:sz w:val="21"/>
           <w:szCs w:val="21"/>
         </w:rPr>
-        <w:t xml:space="preserve">Week 8 · Mon Nov 23 · 🎤 Final show + certificate</w:t>
+        <w:t xml:space="preserve">Week 8 · Mon Dec 7 · 🎤 Final show + certificate</w:t>
       </w:r>
     </w:p>
     <w:p>
@@ -40703,7 +40703,7 @@
           <w:sz w:val="22"/>
           <w:szCs w:val="22"/>
         </w:rPr>
-        <w:t xml:space="preserve">Zoom with kids: cameras on, on-screen names written in 한글 from class 2 onward, chat for emojis only, soft music while they draw. Rehearse the final show from class 7 with a visual script (drawings instead of text), invite the families a week ahead, and confirm the October 12 date (a public holiday in Chile) from class 1 onward.</w:t>
+        <w:t xml:space="preserve">Zoom with kids: cameras on, on-screen names written in 한글 from class 2 onward, chat for emojis only, soft music while they draw. Rehearse the final show from class 7 with a visual script (drawings instead of text), invite the families a week ahead, and remind families from class 1 onward that the course starts Monday October 19 (October 12 is a public holiday in Chile) and ends Monday December 7.</w:t>
       </w:r>
     </w:p>
     <w:p>
@@ -40888,7 +40888,7 @@
           <w:sz w:val="22"/>
           <w:szCs w:val="22"/>
         </w:rPr>
-        <w:t xml:space="preserve">Send the end-of-course report (attendance, grades, level recommendation per student) before November 30.</w:t>
+        <w:t xml:space="preserve">Send the end-of-course report (attendance, grades, level recommendation per student) before December 7.</w:t>
       </w:r>
     </w:p>
     <w:p>

</xml_diff>

<commit_message>
Programa Completo corregido (PDF publicos regenerados), correo de presentacion E0 y E0 educadores, pies de correo para la lista 03
- Programa Completo ES/EN: "Grupo de WhatsApp del curso" (duplicado), sorteo de Conversacional 1 el dom 29 nov, edades de Ninos 11-15, feriado del 12 explicado, precio exacto en Pagos, version 1.1 del 29 sept; docx + pdf y public/programas regenerados
- Programa_Cursos_Octubre_2026: "2 x US$75" con el signo
- E0_Presentacion_Academia_y_Profes (primer contacto, lista 03) + texto para Gmail/WhatsApp; integrado en el calendario y el plan
- E0b_Presentacion_Educadores + notas: la lista de educadores es de terceros y NO va por Brevo (reenvio institucional o 1:1)
- E3/E4/E5/N1: pie verdadero para las listas 01 y 03
- herramientas/limpiar_lista_educadores.js (sin datos; escribe fuera del repo)

Co-Authored-By: Claude Opus 5.5 <noreply@anthropic.com>
</commit_message>
<xml_diff>
--- a/Programa_Completo_Octubre_2026/Programa_Completo_Octubre_2026_EN.docx
+++ b/Programa_Completo_Octubre_2026/Programa_Completo_Octubre_2026_EN.docx
@@ -219,7 +219,7 @@
           <w:sz w:val="17"/>
           <w:szCs w:val="17"/>
         </w:rPr>
-        <w:t xml:space="preserve">Version 1.0 · September 17, 2026 · Single source of course, schedule and teacher data: academiaseul.com/programa. This document is updated every cohort.</w:t>
+        <w:t xml:space="preserve">Version 1.1 · updated September 29, 2026 · Single source of course, schedule and teacher data: academiaseul.com/programa. This document is updated every cohort.</w:t>
       </w:r>
     </w:p>
     <w:p>
@@ -7506,7 +7506,7 @@
                 <w:sz w:val="20"/>
                 <w:szCs w:val="20"/>
               </w:rPr>
-              <w:t xml:space="preserve">Seat confirmed upon payment. Second installment at the start of week 5. Details and refund policy at academiaseul.com/terminos.</w:t>
+              <w:t xml:space="preserve">Price: US$150 for the full course · or 2 payments of US$75 (same price for every course). Seat confirmed upon payment. Second installment at the start of week 5. Details and refund policy at academiaseul.com/terminos.</w:t>
             </w:r>
           </w:p>
         </w:tc>
@@ -8056,12 +8056,8 @@
       </w:tr>
     </w:tbl>
     <w:p>
-      <w:r>
-        <w:br w:type="page"/>
-      </w:r>
-    </w:p>
-    <w:p>
-      <w:pPr>
+      <w:pPr>
+        <w:pageBreakBefore/>
         <w:spacing w:after="200"/>
       </w:pPr>
       <w:r>
@@ -14631,13 +14627,9 @@
       </w:r>
     </w:p>
     <w:p>
-      <w:r>
-        <w:br w:type="page"/>
-      </w:r>
-    </w:p>
-    <w:p>
       <w:pPr>
         <w:keepNext/>
+        <w:pageBreakBefore/>
         <w:pBdr>
           <w:bottom w:val="single" w:color="CCCCCC" w:sz="6" w:space="4"/>
         </w:pBdr>
@@ -20947,7 +20939,7 @@
           <w:sz w:val="22"/>
           <w:szCs w:val="22"/>
         </w:rPr>
-        <w:t xml:space="preserve">Course the course WhatsApp group group for audio homework, mini-diary and questions between classes</w:t>
+        <w:t xml:space="preserve">Course WhatsApp group for audio homework, mini-diary and questions between classes</w:t>
       </w:r>
     </w:p>
     <w:p>
@@ -21202,13 +21194,9 @@
       </w:r>
     </w:p>
     <w:p>
-      <w:r>
-        <w:br w:type="page"/>
-      </w:r>
-    </w:p>
-    <w:p>
       <w:pPr>
         <w:keepNext/>
+        <w:pageBreakBefore/>
         <w:pBdr>
           <w:bottom w:val="single" w:color="CCCCCC" w:sz="6" w:space="4"/>
         </w:pBdr>
@@ -26958,7 +26946,7 @@
           <w:sz w:val="20"/>
           <w:szCs w:val="20"/>
         </w:rPr>
-        <w:t xml:space="preserve">Before class: record the 2-minute monologue on the module you draw in the lottery on Sunday the 22nd (no reading; cue card with keywords only) and prepare both possible role plays</w:t>
+        <w:t xml:space="preserve">Before class: record the 2-minute monologue on the module you draw in the lottery on Sunday, November 29 (no reading; cue card with keywords only) and prepare both possible role plays</w:t>
       </w:r>
     </w:p>
     <w:p>
@@ -27570,7 +27558,7 @@
           <w:sz w:val="22"/>
           <w:szCs w:val="22"/>
         </w:rPr>
-        <w:t xml:space="preserve">the course WhatsApp group group to submit audios, receive corrections and share discoveries between classes</w:t>
+        <w:t xml:space="preserve">The course WhatsApp group to submit audios, receive corrections and share discoveries between classes</w:t>
       </w:r>
     </w:p>
     <w:p>
@@ -27799,13 +27787,9 @@
       </w:r>
     </w:p>
     <w:p>
-      <w:r>
-        <w:br w:type="page"/>
-      </w:r>
-    </w:p>
-    <w:p>
       <w:pPr>
         <w:keepNext/>
+        <w:pageBreakBefore/>
         <w:pBdr>
           <w:bottom w:val="single" w:color="CCCCCC" w:sz="6" w:space="4"/>
         </w:pBdr>
@@ -34115,7 +34099,7 @@
           <w:sz w:val="22"/>
           <w:szCs w:val="22"/>
         </w:rPr>
-        <w:t xml:space="preserve">Course the course WhatsApp group group: homework submission, shared expression bank and questions between classes; recording of each class available 24 hours later</w:t>
+        <w:t xml:space="preserve">Course WhatsApp group: homework submission, shared expression bank and questions between classes; recording of each class available 24 hours later</w:t>
       </w:r>
     </w:p>
     <w:p>
@@ -34370,13 +34354,9 @@
       </w:r>
     </w:p>
     <w:p>
-      <w:r>
-        <w:br w:type="page"/>
-      </w:r>
-    </w:p>
-    <w:p>
       <w:pPr>
         <w:keepNext/>
+        <w:pageBreakBefore/>
         <w:pBdr>
           <w:bottom w:val="single" w:color="CCCCCC" w:sz="6" w:space="4"/>
         </w:pBdr>
@@ -36517,7 +36497,7 @@
                 <w:sz w:val="19"/>
                 <w:szCs w:val="19"/>
               </w:rPr>
-              <w:t xml:space="preserve">Count from 1 to 10 with native Korean numbers, ask 몇 살이에요? and say their own age: 저는 열 살이에요 (열한 / 열두 살 for the older kids).</w:t>
+              <w:t xml:space="preserve">Count from 1 to 10 with native Korean numbers, ask 몇 살이에요? and say their own age: 저는 열 살이에요 (열한 to 열다섯 살 for the older kids).</w:t>
             </w:r>
           </w:p>
         </w:tc>
@@ -38870,7 +38850,7 @@
           <w:sz w:val="20"/>
           <w:szCs w:val="20"/>
         </w:rPr>
-        <w:t xml:space="preserve">Count from 1 to 10 with native Korean numbers, ask 몇 살이에요? and say their own age: 저는 열 살이에요 (열한 / 열두 살 for the older kids).</w:t>
+        <w:t xml:space="preserve">Count from 1 to 10 with native Korean numbers, ask 몇 살이에요? and say their own age: 저는 열 살이에요 (열한 to 열다섯 살 for the older kids).</w:t>
       </w:r>
     </w:p>
     <w:p>
@@ -38939,7 +38919,7 @@
           <w:sz w:val="20"/>
           <w:szCs w:val="20"/>
         </w:rPr>
-        <w:t xml:space="preserve">___ 살이에요 (I am ___ years old) with the short forms 한, 두, 세, 네 before 살; 11- and 12-year-olds say 열한 살, 열두 살</w:t>
+        <w:t xml:space="preserve">___ 살이에요 (I am ___ years old) with the short forms 한, 두, 세, 네 before 살; 11- to 15-year-olds say 열한, 열두, 열세, 열네, 열다섯 살</w:t>
       </w:r>
     </w:p>
     <w:p>
@@ -40707,12 +40687,8 @@
       </w:r>
     </w:p>
     <w:p>
-      <w:r>
-        <w:br w:type="page"/>
-      </w:r>
-    </w:p>
-    <w:p>
-      <w:pPr>
+      <w:pPr>
+        <w:pageBreakBefore/>
         <w:spacing w:after="200"/>
       </w:pPr>
       <w:r>
@@ -43481,7 +43457,7 @@
                 <w:sz w:val="20"/>
                 <w:szCs w:val="20"/>
               </w:rPr>
-              <w:t xml:space="preserve">Classes take place unless announced 48 h ahead. Monday October 12 affects Kids: confirm with families in week 1.</w:t>
+              <w:t xml:space="preserve">Classes take place unless announced 48 h ahead. Because Monday October 12 is a public holiday, Kids starts on Monday October 19: remind families in the welcome message.</w:t>
             </w:r>
           </w:p>
         </w:tc>
@@ -43672,13 +43648,9 @@
       </w:r>
     </w:p>
     <w:p>
-      <w:r>
-        <w:br w:type="page"/>
-      </w:r>
-    </w:p>
-    <w:p>
       <w:pPr>
         <w:keepNext/>
+        <w:pageBreakBefore/>
         <w:pBdr>
           <w:bottom w:val="single" w:color="CCCCCC" w:sz="6" w:space="4"/>
         </w:pBdr>

</xml_diff>